<commit_message>
Fix context menu shortcut label spacing (Rename/Delete)
MainForm.Designer.cs
- Replaced Items.Add("Rename\tF2") and Items.Add("Delete\tDel") with
  explicit ToolStripMenuItem objects using ShortcutKeyDisplayString.
  ContextMenuStrip does not honour the \t tab convention so labels
  rendered as "RenameF2" / "DeleteDel" with no separation. The
  ShortcutKeyDisplayString property renders the hint in the dedicated
  right-hand shortcut column, matching standard Windows menu appearance.

FileExplorer_TechDoc.docx
- Added Section 13 (Session 3 Changes) documenting the fix above
- Added v1.8 row to Change History table

Co-Authored-By: Claude Sonnet 4.6 <noreply@anthropic.com>
</commit_message>
<xml_diff>
--- a/FileExplorer_TechDoc.docx
+++ b/FileExplorer_TechDoc.docx
@@ -32638,6 +32638,127 @@
           </w:p>
         </w:tc>
       </w:tr>
+      <w:tr>
+        <w:trPr>
+          <w:tblHeader w:val="false"/>
+        </w:trPr>
+        <w:tc>
+          <w:tcPr>
+            <w:tcW w:type="dxa" w:w="720"/>
+            <w:tcBorders>
+              <w:top w:val="single" w:color="AAAAAA" w:sz="1"/>
+              <w:left w:val="single" w:color="AAAAAA" w:sz="1"/>
+              <w:bottom w:val="single" w:color="AAAAAA" w:sz="1"/>
+              <w:right w:val="single" w:color="AAAAAA" w:sz="1"/>
+            </w:tcBorders>
+            <w:tcMar>
+              <w:top w:type="dxa" w:w="80"/>
+              <w:left w:type="dxa" w:w="120"/>
+              <w:bottom w:type="dxa" w:w="80"/>
+              <w:right w:type="dxa" w:w="120"/>
+            </w:tcMar>
+          </w:tcPr>
+          <w:p>
+            <w:r>
+              <w:rPr>
+                <w:b w:val="false"/>
+                <w:bCs w:val="false"/>
+                <w:color w:val="000000"/>
+                <w:sz w:val="18"/>
+                <w:szCs w:val="18"/>
+              </w:rPr>
+              <w:t xml:space="preserve">1.8</w:t>
+            </w:r>
+          </w:p>
+        </w:tc>
+        <w:tc>
+          <w:tcPr>
+            <w:tcW w:type="dxa" w:w="1080"/>
+            <w:tcBorders>
+              <w:top w:val="single" w:color="AAAAAA" w:sz="1"/>
+              <w:left w:val="single" w:color="AAAAAA" w:sz="1"/>
+              <w:bottom w:val="single" w:color="AAAAAA" w:sz="1"/>
+              <w:right w:val="single" w:color="AAAAAA" w:sz="1"/>
+            </w:tcBorders>
+            <w:tcMar>
+              <w:top w:type="dxa" w:w="80"/>
+              <w:left w:type="dxa" w:w="120"/>
+              <w:bottom w:type="dxa" w:w="80"/>
+              <w:right w:type="dxa" w:w="120"/>
+            </w:tcMar>
+          </w:tcPr>
+          <w:p>
+            <w:r>
+              <w:rPr>
+                <w:b w:val="false"/>
+                <w:bCs w:val="false"/>
+                <w:color w:val="000000"/>
+                <w:sz w:val="18"/>
+                <w:szCs w:val="18"/>
+              </w:rPr>
+              <w:t xml:space="preserve">2026-05-18</w:t>
+            </w:r>
+          </w:p>
+        </w:tc>
+        <w:tc>
+          <w:tcPr>
+            <w:tcW w:type="dxa" w:w="5400"/>
+            <w:tcBorders>
+              <w:top w:val="single" w:color="AAAAAA" w:sz="1"/>
+              <w:left w:val="single" w:color="AAAAAA" w:sz="1"/>
+              <w:bottom w:val="single" w:color="AAAAAA" w:sz="1"/>
+              <w:right w:val="single" w:color="AAAAAA" w:sz="1"/>
+            </w:tcBorders>
+            <w:tcMar>
+              <w:top w:type="dxa" w:w="80"/>
+              <w:left w:type="dxa" w:w="120"/>
+              <w:bottom w:type="dxa" w:w="80"/>
+              <w:right w:type="dxa" w:w="120"/>
+            </w:tcMar>
+          </w:tcPr>
+          <w:p>
+            <w:r>
+              <w:rPr>
+                <w:b w:val="false"/>
+                <w:bCs w:val="false"/>
+                <w:color w:val="000000"/>
+                <w:sz w:val="18"/>
+                <w:szCs w:val="18"/>
+              </w:rPr>
+              <w:t xml:space="preserve">Bug fix: right-click context menu shortcut labels showed “RenameF2” and “DeleteDel” with no visual separation. Root cause: ToolStripMenuItem text strings used a \t (tab) character to denote the shortcut hint (e.g. “Rename\tF2”), but ContextMenuStrip renders the tab without visible spacing. Fix: replaced the string-based Items.Add calls with explicit ToolStripMenuItem objects whose ShortcutKeyDisplayString property is set to “F2” or “Del”. The shortcut hint now appears in the dedicated right-hand column of the menu, properly separated from the item label.</w:t>
+            </w:r>
+          </w:p>
+        </w:tc>
+        <w:tc>
+          <w:tcPr>
+            <w:tcW w:type="dxa" w:w="2160"/>
+            <w:tcBorders>
+              <w:top w:val="single" w:color="AAAAAA" w:sz="1"/>
+              <w:left w:val="single" w:color="AAAAAA" w:sz="1"/>
+              <w:bottom w:val="single" w:color="AAAAAA" w:sz="1"/>
+              <w:right w:val="single" w:color="AAAAAA" w:sz="1"/>
+            </w:tcBorders>
+            <w:tcMar>
+              <w:top w:type="dxa" w:w="80"/>
+              <w:left w:type="dxa" w:w="120"/>
+              <w:bottom w:type="dxa" w:w="80"/>
+              <w:right w:type="dxa" w:w="120"/>
+            </w:tcMar>
+          </w:tcPr>
+          <w:p>
+            <w:r>
+              <w:rPr>
+                <w:b w:val="false"/>
+                <w:bCs w:val="false"/>
+                <w:color w:val="000000"/>
+                <w:sz w:val="18"/>
+                <w:szCs w:val="18"/>
+              </w:rPr>
+              <w:t xml:space="preserve">MainForm.Designer.cs</w:t>
+            </w:r>
+          </w:p>
+        </w:tc>
+      </w:tr>
     </w:tbl>
     <w:p>
       <w:pPr>
@@ -33905,6 +34026,219 @@
       </w:pPr>
       <w:r>
         <w:t xml:space="preserve">Fix: the throttled call now invokes RefreshExpandedTreeNodes(treeView.Nodes) instead. Every 200 ms, all folders visible in the tree whose scan has already finished get their [size/size] label updated progressively during the scan rather than only at the end. UpdateNodeTextByPath was removed as it became dead code.</w:t>
+      </w:r>
+    </w:p>
+    <w:p>
+      <w:pPr>
+        <w:spacing w:after="0" w:before="0"/>
+      </w:pPr>
+      <w:r>
+        <w:t xml:space="preserve"/>
+      </w:r>
+    </w:p>
+    <w:p>
+      <w:pPr>
+        <w:spacing w:after="0" w:before="0"/>
+      </w:pPr>
+      <w:r>
+        <w:t xml:space="preserve"/>
+      </w:r>
+    </w:p>
+    <w:p>
+      <w:pPr>
+        <w:pStyle w:val="Heading1"/>
+        <w:shd w:fill="1F4E79" w:val="clear"/>
+        <w:spacing w:after="160" w:before="320"/>
+        <w:ind w:left="120" w:right="120"/>
+      </w:pPr>
+      <w:r>
+        <w:rPr>
+          <w:b/>
+          <w:bCs/>
+          <w:color w:val="FFFFFF"/>
+          <w:sz w:val="28"/>
+          <w:szCs w:val="28"/>
+        </w:rPr>
+        <w:t xml:space="preserve">13  Session 3 Changes  (2026-05-18)</w:t>
+      </w:r>
+    </w:p>
+    <w:p>
+      <w:pPr>
+        <w:spacing w:after="0" w:before="0"/>
+      </w:pPr>
+      <w:r>
+        <w:t xml:space="preserve"/>
+      </w:r>
+    </w:p>
+    <w:p>
+      <w:pPr>
+        <w:spacing w:after="0" w:before="0"/>
+      </w:pPr>
+      <w:r>
+        <w:t xml:space="preserve">This section documents the single change made during the third Claude Code session (May 18, 2026).</w:t>
+      </w:r>
+    </w:p>
+    <w:p>
+      <w:pPr>
+        <w:spacing w:after="0" w:before="0"/>
+      </w:pPr>
+      <w:r>
+        <w:t xml:space="preserve"/>
+      </w:r>
+    </w:p>
+    <w:p>
+      <w:pPr>
+        <w:pStyle w:val="Heading2"/>
+        <w:pBdr>
+          <w:bottom w:val="single" w:color="2E75B6" w:sz="6" w:space="4"/>
+        </w:pBdr>
+        <w:spacing w:after="100" w:before="240"/>
+      </w:pPr>
+      <w:r>
+        <w:rPr>
+          <w:b/>
+          <w:bCs/>
+          <w:color w:val="2E75B6"/>
+          <w:sz w:val="24"/>
+          <w:szCs w:val="24"/>
+        </w:rPr>
+        <w:t xml:space="preserve">13.1  Context Menu Shortcut Label Spacing  (MainForm.Designer.cs)</w:t>
+      </w:r>
+    </w:p>
+    <w:p>
+      <w:pPr>
+        <w:spacing w:after="0" w:before="0"/>
+      </w:pPr>
+      <w:r>
+        <w:t xml:space="preserve">Problem: the right-click context menu on the file/folder list pane displayed “RenameF2” and “DeleteDel” with no space or visual gap between the action name and the keyboard shortcut.</w:t>
+      </w:r>
+    </w:p>
+    <w:p>
+      <w:pPr>
+        <w:spacing w:after="0" w:before="0"/>
+      </w:pPr>
+      <w:r>
+        <w:t xml:space="preserve"/>
+      </w:r>
+    </w:p>
+    <w:p>
+      <w:pPr>
+        <w:spacing w:after="0" w:before="0"/>
+      </w:pPr>
+      <w:r>
+        <w:t xml:space="preserve">Root cause: the menu items were created with a \t (tab) embedded in the display string — e.g. Items.Add(“Rename\tF2”, null, handler). In a standard WinForms MainMenu the \t convention right-aligns the shortcut text, but ContextMenuStrip (which derives from ToolStrip) does not honour this convention and renders the literal characters without any separation.</w:t>
+      </w:r>
+    </w:p>
+    <w:p>
+      <w:pPr>
+        <w:spacing w:after="0" w:before="0"/>
+      </w:pPr>
+      <w:r>
+        <w:t xml:space="preserve"/>
+      </w:r>
+    </w:p>
+    <w:p>
+      <w:pPr>
+        <w:spacing w:after="0" w:before="0"/>
+      </w:pPr>
+      <w:r>
+        <w:t xml:space="preserve">Fix: the two Items.Add calls were replaced with explicit ToolStripMenuItem objects. ShortcutKeyDisplayString is set to the shortcut text and the item label contains only the action name:</w:t>
+      </w:r>
+    </w:p>
+    <w:p>
+      <w:pPr>
+        <w:spacing w:after="0" w:before="0"/>
+      </w:pPr>
+      <w:r>
+        <w:t xml:space="preserve"/>
+      </w:r>
+    </w:p>
+    <w:p>
+      <w:pPr>
+        <w:spacing w:after="0" w:before="0"/>
+      </w:pPr>
+      <w:r>
+        <w:t xml:space="preserve">  var menuRename = new ToolStripMenuItem("Rename")</w:t>
+      </w:r>
+    </w:p>
+    <w:p>
+      <w:pPr>
+        <w:spacing w:after="0" w:before="0"/>
+      </w:pPr>
+      <w:r>
+        <w:t xml:space="preserve">      { ShortcutKeyDisplayString = "F2" };</w:t>
+      </w:r>
+    </w:p>
+    <w:p>
+      <w:pPr>
+        <w:spacing w:after="0" w:before="0"/>
+      </w:pPr>
+      <w:r>
+        <w:t xml:space="preserve">  menuRename.Click += ContextMenu_Rename;</w:t>
+      </w:r>
+    </w:p>
+    <w:p>
+      <w:pPr>
+        <w:spacing w:after="0" w:before="0"/>
+      </w:pPr>
+      <w:r>
+        <w:t xml:space="preserve">  listViewMenu.Items.Add(menuRename);</w:t>
+      </w:r>
+    </w:p>
+    <w:p>
+      <w:pPr>
+        <w:spacing w:after="0" w:before="0"/>
+      </w:pPr>
+      <w:r>
+        <w:t xml:space="preserve"/>
+      </w:r>
+    </w:p>
+    <w:p>
+      <w:pPr>
+        <w:spacing w:after="0" w:before="0"/>
+      </w:pPr>
+      <w:r>
+        <w:t xml:space="preserve">  var menuDelete = new ToolStripMenuItem("Delete")</w:t>
+      </w:r>
+    </w:p>
+    <w:p>
+      <w:pPr>
+        <w:spacing w:after="0" w:before="0"/>
+      </w:pPr>
+      <w:r>
+        <w:t xml:space="preserve">      { ShortcutKeyDisplayString = "Del" };</w:t>
+      </w:r>
+    </w:p>
+    <w:p>
+      <w:pPr>
+        <w:spacing w:after="0" w:before="0"/>
+      </w:pPr>
+      <w:r>
+        <w:t xml:space="preserve">  menuDelete.Click += ContextMenu_Delete;</w:t>
+      </w:r>
+    </w:p>
+    <w:p>
+      <w:pPr>
+        <w:spacing w:after="0" w:before="0"/>
+      </w:pPr>
+      <w:r>
+        <w:t xml:space="preserve">  listViewMenu.Items.Add(menuDelete);</w:t>
+      </w:r>
+    </w:p>
+    <w:p>
+      <w:pPr>
+        <w:spacing w:after="0" w:before="0"/>
+      </w:pPr>
+      <w:r>
+        <w:t xml:space="preserve"/>
+      </w:r>
+    </w:p>
+    <w:p>
+      <w:pPr>
+        <w:spacing w:after="0" w:before="0"/>
+      </w:pPr>
+      <w:r>
+        <w:t xml:space="preserve">ShortcutKeyDisplayString renders in the dedicated shortcut column on the right side of the menu strip, matching the standard Windows context menu appearance. Item indices in listViewMenu.Items (used by ListViewMenu_Opening to enable/disable items) are unaffected because the items are added in the same order.</w:t>
       </w:r>
     </w:p>
     <w:p>

</xml_diff>

<commit_message>
Docs: add build, installer, and installation instructions
- TechDoc §8.5: Build & Release — dotnet publish command, ISCC.exe
  command, output paths, installer script/image repo locations
- UserManual §0: Installation — step-by-step Setup Wizard walkthrough,
  optional desktop icon, Finish/Launch, and uninstall instructions

Co-Authored-By: Claude Sonnet 4.6 <noreply@anthropic.com>
</commit_message>
<xml_diff>
--- a/FileExplorer_TechDoc.docx
+++ b/FileExplorer_TechDoc.docx
@@ -31015,6 +31015,362 @@
     </w:p>
     <w:p>
       <w:pPr>
+        <w:pageBreakBefore/>
+      </w:pPr>
+      <w:r>
+        <w:t xml:space="preserve"/>
+      </w:r>
+    </w:p>
+    <w:p>
+      <w:pPr>
+        <w:pStyle w:val="Heading1"/>
+        <w:shd w:fill="1F4E79" w:val="clear"/>
+        <w:spacing w:after="160" w:before="320"/>
+        <w:ind w:left="120" w:right="120"/>
+      </w:pPr>
+      <w:r>
+        <w:rPr>
+          <w:b/>
+          <w:bCs/>
+          <w:color w:val="FFFFFF"/>
+          <w:sz w:val="28"/>
+          <w:szCs w:val="28"/>
+        </w:rPr>
+        <w:t xml:space="preserve">8.5  Build &amp; Release</w:t>
+      </w:r>
+    </w:p>
+    <w:p>
+      <w:pPr>
+        <w:spacing w:after="0" w:before="0"/>
+      </w:pPr>
+      <w:r>
+        <w:t xml:space="preserve"/>
+      </w:r>
+    </w:p>
+    <w:p>
+      <w:pPr>
+        <w:pStyle w:val="Heading2"/>
+        <w:pBdr>
+          <w:bottom w:val="single" w:color="2E75B6" w:sz="6" w:space="4"/>
+        </w:pBdr>
+        <w:spacing w:after="100" w:before="240"/>
+      </w:pPr>
+      <w:r>
+        <w:rPr>
+          <w:b/>
+          <w:bCs/>
+          <w:color w:val="2E75B6"/>
+          <w:sz w:val="24"/>
+          <w:szCs w:val="24"/>
+        </w:rPr>
+        <w:t xml:space="preserve">8.5.1  Building the Executable</w:t>
+      </w:r>
+    </w:p>
+    <w:p>
+      <w:pPr>
+        <w:spacing w:after="60" w:before="60"/>
+      </w:pPr>
+      <w:r>
+        <w:rPr>
+          <w:sz w:val="20"/>
+          <w:szCs w:val="20"/>
+        </w:rPr>
+        <w:t xml:space="preserve">To publish a self-contained single-file executable:</w:t>
+      </w:r>
+    </w:p>
+    <w:p>
+      <w:pPr>
+        <w:pStyle w:val="ListParagraph"/>
+        <w:numPr>
+          <w:ilvl w:val="0"/>
+          <w:numId w:val="3"/>
+        </w:numPr>
+        <w:spacing w:after="40" w:before="40"/>
+      </w:pPr>
+      <w:r>
+        <w:rPr>
+          <w:sz w:val="20"/>
+          <w:szCs w:val="20"/>
+        </w:rPr>
+        <w:t xml:space="preserve">Open PowerShell and navigate to the project folder:</w:t>
+      </w:r>
+    </w:p>
+    <w:p>
+      <w:pPr>
+        <w:pBdr>
+          <w:top w:val="single" w:color="CCCCCC" w:sz="1"/>
+          <w:left w:val="single" w:color="CCCCCC" w:sz="1"/>
+          <w:bottom w:val="single" w:color="CCCCCC" w:sz="1"/>
+          <w:right w:val="single" w:color="CCCCCC" w:sz="1"/>
+        </w:pBdr>
+        <w:shd w:fill="F2F2F2" w:val="clear"/>
+        <w:spacing w:after="80" w:before="0"/>
+        <w:ind w:left="720" w:right="180"/>
+      </w:pPr>
+      <w:r>
+        <w:rPr>
+          <w:rFonts w:ascii="Courier New" w:cs="Courier New" w:eastAsia="Courier New" w:hAnsi="Courier New"/>
+          <w:sz w:val="16"/>
+          <w:szCs w:val="16"/>
+        </w:rPr>
+        <w:t xml:space="preserve">cd C:\ClaudeOutput\FileExplorer</w:t>
+      </w:r>
+    </w:p>
+    <w:p>
+      <w:pPr>
+        <w:pStyle w:val="ListParagraph"/>
+        <w:numPr>
+          <w:ilvl w:val="0"/>
+          <w:numId w:val="3"/>
+        </w:numPr>
+        <w:spacing w:after="40" w:before="40"/>
+      </w:pPr>
+      <w:r>
+        <w:rPr>
+          <w:sz w:val="20"/>
+          <w:szCs w:val="20"/>
+        </w:rPr>
+        <w:t xml:space="preserve">Run the publish command:</w:t>
+      </w:r>
+    </w:p>
+    <w:p>
+      <w:pPr>
+        <w:pBdr>
+          <w:top w:val="single" w:color="CCCCCC" w:sz="1"/>
+          <w:left w:val="single" w:color="CCCCCC" w:sz="1"/>
+          <w:bottom w:val="single" w:color="CCCCCC" w:sz="1"/>
+          <w:right w:val="single" w:color="CCCCCC" w:sz="1"/>
+        </w:pBdr>
+        <w:shd w:fill="F2F2F2" w:val="clear"/>
+        <w:spacing w:after="80" w:before="0"/>
+        <w:ind w:left="720" w:right="180"/>
+      </w:pPr>
+      <w:r>
+        <w:rPr>
+          <w:rFonts w:ascii="Courier New" w:cs="Courier New" w:eastAsia="Courier New" w:hAnsi="Courier New"/>
+          <w:sz w:val="16"/>
+          <w:szCs w:val="16"/>
+        </w:rPr>
+        <w:t xml:space="preserve">dotnet publish -c Release -r win-x64 --self-contained true -p:PublishSingleFile=true -p:PublishReadyToRun=true -o bin\Publish</w:t>
+      </w:r>
+    </w:p>
+    <w:p>
+      <w:pPr>
+        <w:pStyle w:val="ListParagraph"/>
+        <w:numPr>
+          <w:ilvl w:val="0"/>
+          <w:numId w:val="3"/>
+        </w:numPr>
+        <w:spacing w:after="40" w:before="40"/>
+      </w:pPr>
+      <w:r>
+        <w:rPr>
+          <w:sz w:val="20"/>
+          <w:szCs w:val="20"/>
+        </w:rPr>
+        <w:t xml:space="preserve">Output: </w:t>
+      </w:r>
+      <w:r>
+        <w:rPr>
+          <w:rFonts w:ascii="Courier New" w:cs="Courier New" w:eastAsia="Courier New" w:hAnsi="Courier New"/>
+          <w:sz w:val="18"/>
+          <w:szCs w:val="18"/>
+        </w:rPr>
+        <w:t xml:space="preserve">C:\ClaudeOutput\FileExplorer\bin\Publish\FileExplorer.exe</w:t>
+      </w:r>
+    </w:p>
+    <w:p>
+      <w:pPr>
+        <w:spacing w:after="0" w:before="0"/>
+      </w:pPr>
+      <w:r>
+        <w:t xml:space="preserve"/>
+      </w:r>
+    </w:p>
+    <w:p>
+      <w:pPr>
+        <w:pStyle w:val="Heading2"/>
+        <w:pBdr>
+          <w:bottom w:val="single" w:color="2E75B6" w:sz="6" w:space="4"/>
+        </w:pBdr>
+        <w:spacing w:after="100" w:before="240"/>
+      </w:pPr>
+      <w:r>
+        <w:rPr>
+          <w:b/>
+          <w:bCs/>
+          <w:color w:val="2E75B6"/>
+          <w:sz w:val="24"/>
+          <w:szCs w:val="24"/>
+        </w:rPr>
+        <w:t xml:space="preserve">8.5.2  Building the Installer</w:t>
+      </w:r>
+    </w:p>
+    <w:p>
+      <w:pPr>
+        <w:spacing w:after="60" w:before="60"/>
+      </w:pPr>
+      <w:r>
+        <w:rPr>
+          <w:b/>
+          <w:bCs/>
+          <w:sz w:val="20"/>
+          <w:szCs w:val="20"/>
+        </w:rPr>
+        <w:t xml:space="preserve">Prerequisites:</w:t>
+      </w:r>
+      <w:r>
+        <w:rPr>
+          <w:sz w:val="20"/>
+          <w:szCs w:val="20"/>
+        </w:rPr>
+        <w:t xml:space="preserve"> Inno Setup 6 installed at </w:t>
+      </w:r>
+      <w:r>
+        <w:rPr>
+          <w:rFonts w:ascii="Courier New" w:cs="Courier New" w:eastAsia="Courier New" w:hAnsi="Courier New"/>
+          <w:sz w:val="18"/>
+          <w:szCs w:val="18"/>
+        </w:rPr>
+        <w:t xml:space="preserve">C:\Users\rctex\AppData\Local\Programs\Inno Setup 6\</w:t>
+      </w:r>
+    </w:p>
+    <w:p>
+      <w:pPr>
+        <w:spacing w:after="60" w:before="60"/>
+      </w:pPr>
+      <w:r>
+        <w:rPr>
+          <w:sz w:val="20"/>
+          <w:szCs w:val="20"/>
+        </w:rPr>
+        <w:t xml:space="preserve">Steps:</w:t>
+      </w:r>
+    </w:p>
+    <w:p>
+      <w:pPr>
+        <w:pStyle w:val="ListParagraph"/>
+        <w:numPr>
+          <w:ilvl w:val="0"/>
+          <w:numId w:val="4"/>
+        </w:numPr>
+        <w:spacing w:after="40" w:before="40"/>
+      </w:pPr>
+      <w:r>
+        <w:rPr>
+          <w:sz w:val="20"/>
+          <w:szCs w:val="20"/>
+        </w:rPr>
+        <w:t xml:space="preserve">Complete the “Building the Executable” step above first.</w:t>
+      </w:r>
+    </w:p>
+    <w:p>
+      <w:pPr>
+        <w:pStyle w:val="ListParagraph"/>
+        <w:numPr>
+          <w:ilvl w:val="0"/>
+          <w:numId w:val="4"/>
+        </w:numPr>
+        <w:spacing w:after="40" w:before="40"/>
+      </w:pPr>
+      <w:r>
+        <w:rPr>
+          <w:sz w:val="20"/>
+          <w:szCs w:val="20"/>
+        </w:rPr>
+        <w:t xml:space="preserve">Run the Inno Setup compiler:</w:t>
+      </w:r>
+    </w:p>
+    <w:p>
+      <w:pPr>
+        <w:pBdr>
+          <w:top w:val="single" w:color="CCCCCC" w:sz="1"/>
+          <w:left w:val="single" w:color="CCCCCC" w:sz="1"/>
+          <w:bottom w:val="single" w:color="CCCCCC" w:sz="1"/>
+          <w:right w:val="single" w:color="CCCCCC" w:sz="1"/>
+        </w:pBdr>
+        <w:shd w:fill="F2F2F2" w:val="clear"/>
+        <w:spacing w:after="80" w:before="0"/>
+        <w:ind w:left="720" w:right="180"/>
+      </w:pPr>
+      <w:r>
+        <w:rPr>
+          <w:rFonts w:ascii="Courier New" w:cs="Courier New" w:eastAsia="Courier New" w:hAnsi="Courier New"/>
+          <w:sz w:val="16"/>
+          <w:szCs w:val="16"/>
+        </w:rPr>
+        <w:t xml:space="preserve">&amp; "C:\Users\rctex\AppData\Local\Programs\Inno Setup 6\ISCC.exe" "C:\ClaudeOutput\FileExplorer\Installer\FileExplorer.iss"</w:t>
+      </w:r>
+    </w:p>
+    <w:p>
+      <w:pPr>
+        <w:pStyle w:val="ListParagraph"/>
+        <w:numPr>
+          <w:ilvl w:val="0"/>
+          <w:numId w:val="4"/>
+        </w:numPr>
+        <w:spacing w:after="40" w:before="40"/>
+      </w:pPr>
+      <w:r>
+        <w:rPr>
+          <w:sz w:val="20"/>
+          <w:szCs w:val="20"/>
+        </w:rPr>
+        <w:t xml:space="preserve">Output installer: </w:t>
+      </w:r>
+      <w:r>
+        <w:rPr>
+          <w:rFonts w:ascii="Courier New" w:cs="Courier New" w:eastAsia="Courier New" w:hAnsi="Courier New"/>
+          <w:sz w:val="18"/>
+          <w:szCs w:val="18"/>
+        </w:rPr>
+        <w:t xml:space="preserve">C:\ClaudeOutput\FileExplorer\Installer\FileExplorerSetup.exe</w:t>
+      </w:r>
+    </w:p>
+    <w:p>
+      <w:pPr>
+        <w:spacing w:after="60" w:before="60"/>
+      </w:pPr>
+      <w:r>
+        <w:rPr>
+          <w:b/>
+          <w:bCs/>
+          <w:sz w:val="20"/>
+          <w:szCs w:val="20"/>
+        </w:rPr>
+        <w:t xml:space="preserve">Installer script location:</w:t>
+      </w:r>
+      <w:r>
+        <w:rPr>
+          <w:rFonts w:ascii="Courier New" w:cs="Courier New" w:eastAsia="Courier New" w:hAnsi="Courier New"/>
+          <w:sz w:val="18"/>
+          <w:szCs w:val="18"/>
+        </w:rPr>
+        <w:t xml:space="preserve"> C:\ClaudeOutput\FileExplorer\Installer\FileExplorer.iss</w:t>
+      </w:r>
+    </w:p>
+    <w:p>
+      <w:pPr>
+        <w:spacing w:after="60" w:before="60"/>
+      </w:pPr>
+      <w:r>
+        <w:rPr>
+          <w:sz w:val="20"/>
+          <w:szCs w:val="20"/>
+        </w:rPr>
+        <w:t xml:space="preserve">The installer script (FileExplorer.iss) and the wizard images (WizardImage.bmp, WizardSmallImage.bmp) are committed to the repository under the Installer\ folder. Wizard images use the color palette from FileExplorer.ico: #1F4E79 (dark navy), #2E75B6 (steel blue), #B5D2EE (light blue).</w:t>
+      </w:r>
+    </w:p>
+    <w:p>
+      <w:pPr>
+        <w:spacing w:after="0" w:before="0"/>
+      </w:pPr>
+      <w:r>
+        <w:t xml:space="preserve"/>
+      </w:r>
+    </w:p>
+    <w:p>
+      <w:pPr>
         <w:pStyle w:val="Heading1"/>
         <w:shd w:fill="1F4E79" w:val="clear"/>
         <w:spacing w:after="160" w:before="320"/>
@@ -35147,6 +35503,27 @@
       </w:pPr>
     </w:lvl>
   </w:abstractNum>
+  <w:abstractNum w:abstractNumId="3" w15:restartNumberingAfterBreak="0">
+    <w:multiLevelType w:val="hybridMultilevel"/>
+    <w:lvl w:ilvl="0">
+      <w:start w:val="1"/>
+      <w:numFmt w:val="decimal"/>
+      <w:lvlText w:val="%1."/>
+      <w:lvlJc w:val="left"/>
+      <w:pPr>
+        <w:ind w:left="720" w:hanging="360"/>
+      </w:pPr>
+    </w:lvl>
+    <w:lvl w:ilvl="1" w15:tentative="1">
+      <w:start w:val="1"/>
+      <w:numFmt w:val="decimal"/>
+      <w:lvlText w:val="%2."/>
+      <w:lvlJc w:val="left"/>
+      <w:pPr>
+        <w:ind w:left="1440" w:hanging="360"/>
+      </w:pPr>
+    </w:lvl>
+  </w:abstractNum>
   <w:num w:numId="1">
     <w:abstractNumId w:val="1"/>
     <w:lvlOverride w:ilvl="0">
@@ -35155,6 +35532,18 @@
   </w:num>
   <w:num w:numId="2">
     <w:abstractNumId w:val="2"/>
+    <w:lvlOverride w:ilvl="0">
+      <w:startOverride w:val="1"/>
+    </w:lvlOverride>
+  </w:num>
+  <w:num w:numId="3">
+    <w:abstractNumId w:val="3"/>
+    <w:lvlOverride w:ilvl="0">
+      <w:startOverride w:val="1"/>
+    </w:lvlOverride>
+  </w:num>
+  <w:num w:numId="4">
+    <w:abstractNumId w:val="3"/>
     <w:lvlOverride w:ilvl="0">
       <w:startOverride w:val="1"/>
     </w:lvlOverride>

</xml_diff>